<commit_message>
Ajustes visuales menores del diseñador
</commit_message>
<xml_diff>
--- a/Desafio2(CuboOLAP_AdventureWorks.docx
+++ b/Desafio2(CuboOLAP_AdventureWorks.docx
@@ -745,6 +745,7 @@
       <w:r>
         <w:rPr>
           <w:rFonts w:ascii="Times New Roman" w:eastAsia="Times New Roman" w:hAnsi="Times New Roman" w:cs="Times New Roman"/>
+          <w:noProof/>
           <w:sz w:val="20"/>
           <w:szCs w:val="20"/>
           <w:lang w:eastAsia="es-SV"/>
@@ -843,6 +844,7 @@
       <w:r>
         <w:rPr>
           <w:rFonts w:ascii="Times New Roman" w:eastAsia="Times New Roman" w:hAnsi="Times New Roman" w:cs="Times New Roman"/>
+          <w:noProof/>
           <w:sz w:val="20"/>
           <w:szCs w:val="20"/>
           <w:lang w:eastAsia="es-SV"/>
@@ -941,6 +943,7 @@
       <w:r>
         <w:rPr>
           <w:rFonts w:ascii="Times New Roman" w:eastAsia="Times New Roman" w:hAnsi="Times New Roman" w:cs="Times New Roman"/>
+          <w:noProof/>
           <w:sz w:val="20"/>
           <w:szCs w:val="20"/>
           <w:lang w:eastAsia="es-SV"/>
@@ -1017,6 +1020,7 @@
       <w:r>
         <w:rPr>
           <w:rFonts w:ascii="Times New Roman" w:eastAsia="Times New Roman" w:hAnsi="Times New Roman" w:cs="Times New Roman"/>
+          <w:noProof/>
           <w:sz w:val="20"/>
           <w:szCs w:val="20"/>
           <w:lang w:eastAsia="es-SV"/>
@@ -1115,6 +1119,7 @@
       <w:r>
         <w:rPr>
           <w:rFonts w:ascii="Times New Roman" w:eastAsia="Times New Roman" w:hAnsi="Times New Roman" w:cs="Times New Roman"/>
+          <w:noProof/>
           <w:sz w:val="20"/>
           <w:szCs w:val="20"/>
           <w:lang w:eastAsia="es-SV"/>
@@ -1191,6 +1196,7 @@
       <w:r>
         <w:rPr>
           <w:rFonts w:ascii="Times New Roman" w:eastAsia="Times New Roman" w:hAnsi="Times New Roman" w:cs="Times New Roman"/>
+          <w:noProof/>
           <w:sz w:val="20"/>
           <w:szCs w:val="20"/>
           <w:lang w:eastAsia="es-SV"/>
@@ -1289,6 +1295,7 @@
       <w:r>
         <w:rPr>
           <w:rFonts w:ascii="Times New Roman" w:eastAsia="Times New Roman" w:hAnsi="Times New Roman" w:cs="Times New Roman"/>
+          <w:noProof/>
           <w:sz w:val="20"/>
           <w:szCs w:val="20"/>
           <w:lang w:eastAsia="es-SV"/>
@@ -1349,6 +1356,104 @@
           <w:lang w:eastAsia="es-SV"/>
           <w14:ligatures w14:val="none"/>
         </w:rPr>
+        <w:t>Calculo con Nombre</w:t>
+      </w:r>
+    </w:p>
+    <w:p>
+      <w:pPr>
+        <w:rPr>
+          <w:rFonts w:ascii="Times New Roman" w:eastAsia="Times New Roman" w:hAnsi="Times New Roman" w:cs="Times New Roman"/>
+          <w:sz w:val="20"/>
+          <w:szCs w:val="20"/>
+          <w:lang w:eastAsia="es-SV"/>
+          <w14:ligatures w14:val="none"/>
+        </w:rPr>
+      </w:pPr>
+      <w:r>
+        <w:rPr>
+          <w:rFonts w:ascii="Times New Roman" w:eastAsia="Times New Roman" w:hAnsi="Times New Roman" w:cs="Times New Roman"/>
+          <w:sz w:val="20"/>
+          <w:szCs w:val="20"/>
+          <w:lang w:eastAsia="es-SV"/>
+          <w14:ligatures w14:val="none"/>
+        </w:rPr>
+        <w:drawing>
+          <wp:inline distT="0" distB="0" distL="0" distR="0" wp14:anchorId="59B911E0" wp14:editId="2BEF9D50">
+            <wp:extent cx="5761219" cy="3635055"/>
+            <wp:effectExtent l="0" t="0" r="0" b="3810"/>
+            <wp:docPr id="444746877" name="Imagen 1"/>
+            <wp:cNvGraphicFramePr>
+              <a:graphicFrameLocks xmlns:a="http://schemas.openxmlformats.org/drawingml/2006/main" noChangeAspect="1"/>
+            </wp:cNvGraphicFramePr>
+            <a:graphic xmlns:a="http://schemas.openxmlformats.org/drawingml/2006/main">
+              <a:graphicData uri="http://schemas.openxmlformats.org/drawingml/2006/picture">
+                <pic:pic xmlns:pic="http://schemas.openxmlformats.org/drawingml/2006/picture">
+                  <pic:nvPicPr>
+                    <pic:cNvPr id="444746877" name=""/>
+                    <pic:cNvPicPr/>
+                  </pic:nvPicPr>
+                  <pic:blipFill>
+                    <a:blip r:embed="rId12"/>
+                    <a:stretch>
+                      <a:fillRect/>
+                    </a:stretch>
+                  </pic:blipFill>
+                  <pic:spPr>
+                    <a:xfrm>
+                      <a:off x="0" y="0"/>
+                      <a:ext cx="5761219" cy="3635055"/>
+                    </a:xfrm>
+                    <a:prstGeom prst="rect">
+                      <a:avLst/>
+                    </a:prstGeom>
+                  </pic:spPr>
+                </pic:pic>
+              </a:graphicData>
+            </a:graphic>
+          </wp:inline>
+        </w:drawing>
+      </w:r>
+    </w:p>
+    <w:p>
+      <w:pPr>
+        <w:rPr>
+          <w:rFonts w:ascii="Times New Roman" w:eastAsia="Times New Roman" w:hAnsi="Times New Roman" w:cs="Times New Roman"/>
+          <w:sz w:val="20"/>
+          <w:szCs w:val="20"/>
+          <w:lang w:eastAsia="es-SV"/>
+          <w14:ligatures w14:val="none"/>
+        </w:rPr>
+      </w:pPr>
+      <w:r>
+        <w:rPr>
+          <w:rFonts w:ascii="Times New Roman" w:eastAsia="Times New Roman" w:hAnsi="Times New Roman" w:cs="Times New Roman"/>
+          <w:sz w:val="20"/>
+          <w:szCs w:val="20"/>
+          <w:lang w:eastAsia="es-SV"/>
+          <w14:ligatures w14:val="none"/>
+        </w:rPr>
+        <w:br w:type="page"/>
+      </w:r>
+    </w:p>
+    <w:p>
+      <w:pPr>
+        <w:rPr>
+          <w:rFonts w:ascii="Times New Roman" w:eastAsia="Times New Roman" w:hAnsi="Times New Roman" w:cs="Times New Roman"/>
+          <w:sz w:val="20"/>
+          <w:szCs w:val="20"/>
+          <w:lang w:eastAsia="es-SV"/>
+          <w14:ligatures w14:val="none"/>
+        </w:rPr>
+      </w:pPr>
+      <w:r>
+        <w:rPr>
+          <w:rFonts w:ascii="Times New Roman" w:eastAsia="Times New Roman" w:hAnsi="Times New Roman" w:cs="Times New Roman"/>
+          <w:sz w:val="20"/>
+          <w:szCs w:val="20"/>
+          <w:lang w:eastAsia="es-SV"/>
+          <w14:ligatures w14:val="none"/>
+        </w:rPr>
+        <w:lastRenderedPageBreak/>
         <w:t>Diseño del Informe</w:t>
       </w:r>
     </w:p>
@@ -1365,6 +1470,7 @@
       <w:r>
         <w:rPr>
           <w:rFonts w:ascii="Times New Roman" w:eastAsia="Times New Roman" w:hAnsi="Times New Roman" w:cs="Times New Roman"/>
+          <w:noProof/>
           <w:sz w:val="20"/>
           <w:szCs w:val="20"/>
           <w:lang w:eastAsia="es-SV"/>
@@ -1386,7 +1492,7 @@
                     <pic:cNvPicPr/>
                   </pic:nvPicPr>
                   <pic:blipFill>
-                    <a:blip r:embed="rId12"/>
+                    <a:blip r:embed="rId13"/>
                     <a:stretch>
                       <a:fillRect/>
                     </a:stretch>
@@ -1425,28 +1531,6 @@
           <w:lang w:eastAsia="es-SV"/>
           <w14:ligatures w14:val="none"/>
         </w:rPr>
-        <w:br w:type="page"/>
-      </w:r>
-    </w:p>
-    <w:p>
-      <w:pPr>
-        <w:rPr>
-          <w:rFonts w:ascii="Times New Roman" w:eastAsia="Times New Roman" w:hAnsi="Times New Roman" w:cs="Times New Roman"/>
-          <w:sz w:val="20"/>
-          <w:szCs w:val="20"/>
-          <w:lang w:eastAsia="es-SV"/>
-          <w14:ligatures w14:val="none"/>
-        </w:rPr>
-      </w:pPr>
-      <w:r>
-        <w:rPr>
-          <w:rFonts w:ascii="Times New Roman" w:eastAsia="Times New Roman" w:hAnsi="Times New Roman" w:cs="Times New Roman"/>
-          <w:sz w:val="20"/>
-          <w:szCs w:val="20"/>
-          <w:lang w:eastAsia="es-SV"/>
-          <w14:ligatures w14:val="none"/>
-        </w:rPr>
-        <w:lastRenderedPageBreak/>
         <w:t>Previsualización del reporte</w:t>
       </w:r>
     </w:p>
@@ -1474,6 +1558,7 @@
       <w:r>
         <w:rPr>
           <w:rFonts w:ascii="Times New Roman" w:eastAsia="Times New Roman" w:hAnsi="Times New Roman" w:cs="Times New Roman"/>
+          <w:noProof/>
           <w:sz w:val="20"/>
           <w:szCs w:val="20"/>
           <w:lang w:eastAsia="es-SV"/>
@@ -1495,7 +1580,7 @@
                     <pic:cNvPicPr/>
                   </pic:nvPicPr>
                   <pic:blipFill>
-                    <a:blip r:embed="rId13"/>
+                    <a:blip r:embed="rId14"/>
                     <a:stretch>
                       <a:fillRect/>
                     </a:stretch>
@@ -1515,6 +1600,38 @@
           </wp:inline>
         </w:drawing>
       </w:r>
+    </w:p>
+    <w:p>
+      <w:pPr>
+        <w:rPr>
+          <w:rFonts w:ascii="Times New Roman" w:eastAsia="Times New Roman" w:hAnsi="Times New Roman" w:cs="Times New Roman"/>
+          <w:sz w:val="20"/>
+          <w:szCs w:val="20"/>
+          <w:lang w:eastAsia="es-SV"/>
+          <w14:ligatures w14:val="none"/>
+        </w:rPr>
+      </w:pPr>
+      <w:r>
+        <w:rPr>
+          <w:rFonts w:ascii="Times New Roman" w:eastAsia="Times New Roman" w:hAnsi="Times New Roman" w:cs="Times New Roman"/>
+          <w:sz w:val="20"/>
+          <w:szCs w:val="20"/>
+          <w:lang w:eastAsia="es-SV"/>
+          <w14:ligatures w14:val="none"/>
+        </w:rPr>
+        <w:br w:type="page"/>
+      </w:r>
+    </w:p>
+    <w:p>
+      <w:pPr>
+        <w:rPr>
+          <w:rFonts w:ascii="Times New Roman" w:eastAsia="Times New Roman" w:hAnsi="Times New Roman" w:cs="Times New Roman"/>
+          <w:sz w:val="20"/>
+          <w:szCs w:val="20"/>
+          <w:lang w:eastAsia="es-SV"/>
+          <w14:ligatures w14:val="none"/>
+        </w:rPr>
+      </w:pPr>
       <w:proofErr w:type="spellStart"/>
       <w:r>
         <w:rPr>
@@ -1524,6 +1641,7 @@
           <w:lang w:eastAsia="es-SV"/>
           <w14:ligatures w14:val="none"/>
         </w:rPr>
+        <w:lastRenderedPageBreak/>
         <w:t>DashBoard</w:t>
       </w:r>
       <w:proofErr w:type="spellEnd"/>
@@ -1551,6 +1669,7 @@
       <w:r>
         <w:rPr>
           <w:rFonts w:ascii="Times New Roman" w:eastAsia="Times New Roman" w:hAnsi="Times New Roman" w:cs="Times New Roman"/>
+          <w:noProof/>
           <w:sz w:val="20"/>
           <w:szCs w:val="20"/>
           <w:lang w:eastAsia="es-SV"/>
@@ -1572,7 +1691,7 @@
                     <pic:cNvPicPr/>
                   </pic:nvPicPr>
                   <pic:blipFill>
-                    <a:blip r:embed="rId14"/>
+                    <a:blip r:embed="rId15"/>
                     <a:stretch>
                       <a:fillRect/>
                     </a:stretch>
@@ -1603,27 +1722,6 @@
           <w14:ligatures w14:val="none"/>
         </w:rPr>
       </w:pPr>
-      <w:r>
-        <w:rPr>
-          <w:rFonts w:ascii="Times New Roman" w:eastAsia="Times New Roman" w:hAnsi="Times New Roman" w:cs="Times New Roman"/>
-          <w:sz w:val="20"/>
-          <w:szCs w:val="20"/>
-          <w:lang w:eastAsia="es-SV"/>
-          <w14:ligatures w14:val="none"/>
-        </w:rPr>
-        <w:br w:type="page"/>
-      </w:r>
-    </w:p>
-    <w:p>
-      <w:pPr>
-        <w:rPr>
-          <w:rFonts w:ascii="Times New Roman" w:eastAsia="Times New Roman" w:hAnsi="Times New Roman" w:cs="Times New Roman"/>
-          <w:sz w:val="20"/>
-          <w:szCs w:val="20"/>
-          <w:lang w:eastAsia="es-SV"/>
-          <w14:ligatures w14:val="none"/>
-        </w:rPr>
-      </w:pPr>
       <w:proofErr w:type="spellStart"/>
       <w:r>
         <w:rPr>
@@ -1633,7 +1731,6 @@
           <w:lang w:eastAsia="es-SV"/>
           <w14:ligatures w14:val="none"/>
         </w:rPr>
-        <w:lastRenderedPageBreak/>
         <w:t>DashBoard</w:t>
       </w:r>
       <w:proofErr w:type="spellEnd"/>
@@ -1671,6 +1768,7 @@
       <w:r>
         <w:rPr>
           <w:rFonts w:ascii="Times New Roman" w:eastAsia="Times New Roman" w:hAnsi="Times New Roman" w:cs="Times New Roman"/>
+          <w:noProof/>
           <w:sz w:val="20"/>
           <w:szCs w:val="20"/>
           <w:lang w:eastAsia="es-SV"/>
@@ -1689,104 +1787,6 @@
                 <pic:pic xmlns:pic="http://schemas.openxmlformats.org/drawingml/2006/picture">
                   <pic:nvPicPr>
                     <pic:cNvPr id="1032002175" name=""/>
-                    <pic:cNvPicPr/>
-                  </pic:nvPicPr>
-                  <pic:blipFill>
-                    <a:blip r:embed="rId15"/>
-                    <a:stretch>
-                      <a:fillRect/>
-                    </a:stretch>
-                  </pic:blipFill>
-                  <pic:spPr>
-                    <a:xfrm>
-                      <a:off x="0" y="0"/>
-                      <a:ext cx="5943600" cy="3328670"/>
-                    </a:xfrm>
-                    <a:prstGeom prst="rect">
-                      <a:avLst/>
-                    </a:prstGeom>
-                  </pic:spPr>
-                </pic:pic>
-              </a:graphicData>
-            </a:graphic>
-          </wp:inline>
-        </w:drawing>
-      </w:r>
-    </w:p>
-    <w:p>
-      <w:pPr>
-        <w:rPr>
-          <w:rFonts w:ascii="Times New Roman" w:eastAsia="Times New Roman" w:hAnsi="Times New Roman" w:cs="Times New Roman"/>
-          <w:sz w:val="20"/>
-          <w:szCs w:val="20"/>
-          <w:lang w:eastAsia="es-SV"/>
-          <w14:ligatures w14:val="none"/>
-        </w:rPr>
-      </w:pPr>
-      <w:proofErr w:type="spellStart"/>
-      <w:r>
-        <w:rPr>
-          <w:rFonts w:ascii="Times New Roman" w:eastAsia="Times New Roman" w:hAnsi="Times New Roman" w:cs="Times New Roman"/>
-          <w:sz w:val="20"/>
-          <w:szCs w:val="20"/>
-          <w:lang w:eastAsia="es-SV"/>
-          <w14:ligatures w14:val="none"/>
-        </w:rPr>
-        <w:t>DashBoard</w:t>
-      </w:r>
-      <w:proofErr w:type="spellEnd"/>
-      <w:r>
-        <w:rPr>
-          <w:rFonts w:ascii="Times New Roman" w:eastAsia="Times New Roman" w:hAnsi="Times New Roman" w:cs="Times New Roman"/>
-          <w:sz w:val="20"/>
-          <w:szCs w:val="20"/>
-          <w:lang w:eastAsia="es-SV"/>
-          <w14:ligatures w14:val="none"/>
-        </w:rPr>
-        <w:t xml:space="preserve"> Power BI con año se</w:t>
-      </w:r>
-      <w:r>
-        <w:rPr>
-          <w:rFonts w:ascii="Times New Roman" w:eastAsia="Times New Roman" w:hAnsi="Times New Roman" w:cs="Times New Roman"/>
-          <w:sz w:val="20"/>
-          <w:szCs w:val="20"/>
-          <w:lang w:eastAsia="es-SV"/>
-          <w14:ligatures w14:val="none"/>
-        </w:rPr>
-        <w:t>leccionado</w:t>
-      </w:r>
-    </w:p>
-    <w:p>
-      <w:pPr>
-        <w:rPr>
-          <w:rFonts w:ascii="Times New Roman" w:eastAsia="Times New Roman" w:hAnsi="Times New Roman" w:cs="Times New Roman"/>
-          <w:sz w:val="20"/>
-          <w:szCs w:val="20"/>
-          <w:lang w:eastAsia="es-SV"/>
-          <w14:ligatures w14:val="none"/>
-        </w:rPr>
-      </w:pPr>
-      <w:r>
-        <w:rPr>
-          <w:rFonts w:ascii="Times New Roman" w:eastAsia="Times New Roman" w:hAnsi="Times New Roman" w:cs="Times New Roman"/>
-          <w:sz w:val="20"/>
-          <w:szCs w:val="20"/>
-          <w:lang w:eastAsia="es-SV"/>
-          <w14:ligatures w14:val="none"/>
-        </w:rPr>
-        <w:drawing>
-          <wp:inline distT="0" distB="0" distL="0" distR="0" wp14:anchorId="5304272F" wp14:editId="2D6A1185">
-            <wp:extent cx="5943600" cy="3328670"/>
-            <wp:effectExtent l="0" t="0" r="0" b="5080"/>
-            <wp:docPr id="907703406" name="Imagen 1"/>
-            <wp:cNvGraphicFramePr>
-              <a:graphicFrameLocks xmlns:a="http://schemas.openxmlformats.org/drawingml/2006/main" noChangeAspect="1"/>
-            </wp:cNvGraphicFramePr>
-            <a:graphic xmlns:a="http://schemas.openxmlformats.org/drawingml/2006/main">
-              <a:graphicData uri="http://schemas.openxmlformats.org/drawingml/2006/picture">
-                <pic:pic xmlns:pic="http://schemas.openxmlformats.org/drawingml/2006/picture">
-                  <pic:nvPicPr>
-                    <pic:cNvPr id="907703406" name=""/>
                     <pic:cNvPicPr/>
                   </pic:nvPicPr>
                   <pic:blipFill>
@@ -1863,6 +1863,105 @@
           <w:lang w:eastAsia="es-SV"/>
           <w14:ligatures w14:val="none"/>
         </w:rPr>
+        <w:t xml:space="preserve"> Power BI con año se</w:t>
+      </w:r>
+      <w:r>
+        <w:rPr>
+          <w:rFonts w:ascii="Times New Roman" w:eastAsia="Times New Roman" w:hAnsi="Times New Roman" w:cs="Times New Roman"/>
+          <w:sz w:val="20"/>
+          <w:szCs w:val="20"/>
+          <w:lang w:eastAsia="es-SV"/>
+          <w14:ligatures w14:val="none"/>
+        </w:rPr>
+        <w:t>leccionado</w:t>
+      </w:r>
+    </w:p>
+    <w:p>
+      <w:pPr>
+        <w:rPr>
+          <w:rFonts w:ascii="Times New Roman" w:eastAsia="Times New Roman" w:hAnsi="Times New Roman" w:cs="Times New Roman"/>
+          <w:sz w:val="20"/>
+          <w:szCs w:val="20"/>
+          <w:lang w:eastAsia="es-SV"/>
+          <w14:ligatures w14:val="none"/>
+        </w:rPr>
+      </w:pPr>
+      <w:r>
+        <w:rPr>
+          <w:rFonts w:ascii="Times New Roman" w:eastAsia="Times New Roman" w:hAnsi="Times New Roman" w:cs="Times New Roman"/>
+          <w:noProof/>
+          <w:sz w:val="20"/>
+          <w:szCs w:val="20"/>
+          <w:lang w:eastAsia="es-SV"/>
+          <w14:ligatures w14:val="none"/>
+        </w:rPr>
+        <w:drawing>
+          <wp:inline distT="0" distB="0" distL="0" distR="0" wp14:anchorId="5304272F" wp14:editId="2D6A1185">
+            <wp:extent cx="5943600" cy="3328670"/>
+            <wp:effectExtent l="0" t="0" r="0" b="5080"/>
+            <wp:docPr id="907703406" name="Imagen 1"/>
+            <wp:cNvGraphicFramePr>
+              <a:graphicFrameLocks xmlns:a="http://schemas.openxmlformats.org/drawingml/2006/main" noChangeAspect="1"/>
+            </wp:cNvGraphicFramePr>
+            <a:graphic xmlns:a="http://schemas.openxmlformats.org/drawingml/2006/main">
+              <a:graphicData uri="http://schemas.openxmlformats.org/drawingml/2006/picture">
+                <pic:pic xmlns:pic="http://schemas.openxmlformats.org/drawingml/2006/picture">
+                  <pic:nvPicPr>
+                    <pic:cNvPr id="907703406" name=""/>
+                    <pic:cNvPicPr/>
+                  </pic:nvPicPr>
+                  <pic:blipFill>
+                    <a:blip r:embed="rId17"/>
+                    <a:stretch>
+                      <a:fillRect/>
+                    </a:stretch>
+                  </pic:blipFill>
+                  <pic:spPr>
+                    <a:xfrm>
+                      <a:off x="0" y="0"/>
+                      <a:ext cx="5943600" cy="3328670"/>
+                    </a:xfrm>
+                    <a:prstGeom prst="rect">
+                      <a:avLst/>
+                    </a:prstGeom>
+                  </pic:spPr>
+                </pic:pic>
+              </a:graphicData>
+            </a:graphic>
+          </wp:inline>
+        </w:drawing>
+      </w:r>
+    </w:p>
+    <w:p>
+      <w:pPr>
+        <w:rPr>
+          <w:rFonts w:ascii="Times New Roman" w:eastAsia="Times New Roman" w:hAnsi="Times New Roman" w:cs="Times New Roman"/>
+          <w:sz w:val="20"/>
+          <w:szCs w:val="20"/>
+          <w:lang w:eastAsia="es-SV"/>
+          <w14:ligatures w14:val="none"/>
+        </w:rPr>
+      </w:pPr>
+      <w:proofErr w:type="spellStart"/>
+      <w:r>
+        <w:rPr>
+          <w:rFonts w:ascii="Times New Roman" w:eastAsia="Times New Roman" w:hAnsi="Times New Roman" w:cs="Times New Roman"/>
+          <w:sz w:val="20"/>
+          <w:szCs w:val="20"/>
+          <w:lang w:eastAsia="es-SV"/>
+          <w14:ligatures w14:val="none"/>
+        </w:rPr>
+        <w:t>DashBoard</w:t>
+      </w:r>
+      <w:proofErr w:type="spellEnd"/>
+      <w:r>
+        <w:rPr>
+          <w:rFonts w:ascii="Times New Roman" w:eastAsia="Times New Roman" w:hAnsi="Times New Roman" w:cs="Times New Roman"/>
+          <w:sz w:val="20"/>
+          <w:szCs w:val="20"/>
+          <w:lang w:eastAsia="es-SV"/>
+          <w14:ligatures w14:val="none"/>
+        </w:rPr>
         <w:t xml:space="preserve"> Power BI país seleccionado</w:t>
       </w:r>
     </w:p>
@@ -1879,6 +1978,7 @@
       <w:r>
         <w:rPr>
           <w:rFonts w:ascii="Times New Roman" w:eastAsia="Times New Roman" w:hAnsi="Times New Roman" w:cs="Times New Roman"/>
+          <w:noProof/>
           <w:sz w:val="20"/>
           <w:szCs w:val="20"/>
           <w:lang w:eastAsia="es-SV"/>
@@ -1900,7 +2000,7 @@
                     <pic:cNvPicPr/>
                   </pic:nvPicPr>
                   <pic:blipFill>
-                    <a:blip r:embed="rId17"/>
+                    <a:blip r:embed="rId18"/>
                     <a:stretch>
                       <a:fillRect/>
                     </a:stretch>
@@ -1931,6 +2031,27 @@
           <w14:ligatures w14:val="none"/>
         </w:rPr>
       </w:pPr>
+      <w:r>
+        <w:rPr>
+          <w:rFonts w:ascii="Times New Roman" w:eastAsia="Times New Roman" w:hAnsi="Times New Roman" w:cs="Times New Roman"/>
+          <w:sz w:val="20"/>
+          <w:szCs w:val="20"/>
+          <w:lang w:eastAsia="es-SV"/>
+          <w14:ligatures w14:val="none"/>
+        </w:rPr>
+        <w:br w:type="page"/>
+      </w:r>
+    </w:p>
+    <w:p>
+      <w:pPr>
+        <w:rPr>
+          <w:rFonts w:ascii="Times New Roman" w:eastAsia="Times New Roman" w:hAnsi="Times New Roman" w:cs="Times New Roman"/>
+          <w:sz w:val="20"/>
+          <w:szCs w:val="20"/>
+          <w:lang w:eastAsia="es-SV"/>
+          <w14:ligatures w14:val="none"/>
+        </w:rPr>
+      </w:pPr>
       <w:proofErr w:type="spellStart"/>
       <w:r>
         <w:rPr>
@@ -1940,6 +2061,7 @@
           <w:lang w:eastAsia="es-SV"/>
           <w14:ligatures w14:val="none"/>
         </w:rPr>
+        <w:lastRenderedPageBreak/>
         <w:t>DashBoard</w:t>
       </w:r>
       <w:proofErr w:type="spellEnd"/>
@@ -1997,6 +2119,7 @@
       <w:r>
         <w:rPr>
           <w:rFonts w:ascii="Times New Roman" w:eastAsia="Times New Roman" w:hAnsi="Times New Roman" w:cs="Times New Roman"/>
+          <w:noProof/>
           <w:sz w:val="20"/>
           <w:szCs w:val="20"/>
           <w:lang w:eastAsia="es-SV"/>
@@ -2018,7 +2141,7 @@
                     <pic:cNvPicPr/>
                   </pic:nvPicPr>
                   <pic:blipFill>
-                    <a:blip r:embed="rId18"/>
+                    <a:blip r:embed="rId19"/>
                     <a:stretch>
                       <a:fillRect/>
                     </a:stretch>
@@ -2651,6 +2774,7 @@
   <w:style w:type="character" w:default="1" w:styleId="Fuentedeprrafopredeter">
     <w:name w:val="Default Paragraph Font"/>
     <w:uiPriority w:val="1"/>
+    <w:semiHidden/>
     <w:unhideWhenUsed/>
   </w:style>
   <w:style w:type="table" w:default="1" w:styleId="Tablanormal">

</xml_diff>